<commit_message>
feat: Pequeños cambios al diseño de los dialogos
</commit_message>
<xml_diff>
--- a/Prompts Utilizados para la creación del juego.docx
+++ b/Prompts Utilizados para la creación del juego.docx
@@ -4,6 +4,9 @@
   <w:body>
     <w:p>
       <w:r>
+        <w:rPr>
+          <w:noProof/>
+        </w:rPr>
         <w:drawing>
           <wp:inline distT="0" distB="0" distL="0" distR="0" wp14:anchorId="245DFA0F" wp14:editId="01A18944">
             <wp:extent cx="5612130" cy="3530600"/>
@@ -186,6 +189,9 @@
         <w:br/>
       </w:r>
       <w:r>
+        <w:rPr>
+          <w:noProof/>
+        </w:rPr>
         <w:drawing>
           <wp:anchor distT="0" distB="0" distL="114300" distR="114300" simplePos="0" relativeHeight="251658240" behindDoc="0" locked="0" layoutInCell="1" allowOverlap="1" wp14:anchorId="6E249365" wp14:editId="6C05064D">
             <wp:simplePos x="0" y="0"/>
@@ -246,6 +252,9 @@
         <w:br/>
       </w:r>
       <w:r>
+        <w:rPr>
+          <w:noProof/>
+        </w:rPr>
         <w:drawing>
           <wp:anchor distT="0" distB="0" distL="114300" distR="114300" simplePos="0" relativeHeight="251659264" behindDoc="0" locked="0" layoutInCell="1" allowOverlap="1" wp14:anchorId="297CE5FE" wp14:editId="765861DD">
             <wp:simplePos x="0" y="0"/>
@@ -483,6 +492,80 @@
       </w:r>
       <w:r>
         <w:t>.</w:t>
+      </w:r>
+      <w:r>
+        <w:br/>
+      </w:r>
+      <w:r>
+        <w:br/>
+      </w:r>
+      <w:r>
+        <w:br/>
+      </w:r>
+      <w:r>
+        <w:rPr>
+          <w:b/>
+          <w:bCs/>
+        </w:rPr>
+        <w:t>Lo que aprendí</w:t>
+      </w:r>
+      <w:r>
+        <w:rPr>
+          <w:b/>
+          <w:bCs/>
+        </w:rPr>
+        <w:br/>
+      </w:r>
+      <w:r>
+        <w:rPr>
+          <w:b/>
+          <w:bCs/>
+        </w:rPr>
+        <w:br/>
+      </w:r>
+      <w:r>
+        <w:t xml:space="preserve">La </w:t>
+      </w:r>
+      <w:r>
+        <w:t>IA</w:t>
+      </w:r>
+      <w:r>
+        <w:t xml:space="preserve"> es una gran herramienta con solo 3 </w:t>
+      </w:r>
+      <w:proofErr w:type="spellStart"/>
+      <w:r>
+        <w:t>prompts</w:t>
+      </w:r>
+      <w:proofErr w:type="spellEnd"/>
+      <w:r>
+        <w:t xml:space="preserve"> fueron suficiente para crear un juego y los últimos 2 fueron pequeños cambios al diseño, solo con unas pequeñas indicaciones fue capaz de crear una aplicación con un diseño que talvez no sea el mejor, supera al de muchos programadores van comenzando, te da muy buenas bases para que tu luego vayas modificando e ir personalizando a tu gusto, uno de los limites actuales que note por lo menos en mi caso, al querer crear un juego, necesito de imágenes y la generación de imágenes de momento es muy limitada y por eso se me ocurrió la idea de que el usuario pudiera subir las </w:t>
+      </w:r>
+      <w:r>
+        <w:t>imágenes</w:t>
+      </w:r>
+      <w:r>
+        <w:t xml:space="preserve"> y que hubieran unas de pruebas, </w:t>
+      </w:r>
+      <w:r>
+        <w:t>así</w:t>
+      </w:r>
+      <w:r>
+        <w:t xml:space="preserve"> logre que el juego fuera mas personalizable para cada jugador, en pocas palabras trate de aprovechar una debilidad y convertirla en una fortaleza, mas sin embargo solo 4 personajes siguen siendo muy pocos y abran jugadores que quieran solo jugar y no personalizar tanto, </w:t>
+      </w:r>
+      <w:r>
+        <w:t xml:space="preserve">en mi caso uso cursor, y me parece que es una herramienta que te ahorra mucho tiempo al programar pero también hace que la interacción que tienes con el código se vuelve menor, ya que el genera todo y no te fuerza a interactuar con el código, por lo que no te permite aprender sobre el código y como se fue desarrollando, para ir aprendiendo uso otras herramientas, en este caso para poder generar la app funcionando sin errores con solo un </w:t>
+      </w:r>
+      <w:proofErr w:type="spellStart"/>
+      <w:r>
+        <w:t>prompt</w:t>
+      </w:r>
+      <w:proofErr w:type="spellEnd"/>
+      <w:r>
+        <w:t xml:space="preserve"> opte por esta, </w:t>
+      </w:r>
+      <w:r>
+        <w:lastRenderedPageBreak/>
+        <w:t>no tengo mucho conocimiento sobre Python, por eso me he puesto como meta volver a crear la app por mi cuenta con Claude como profesor a ver si logro crear una app mas refinada y mejor que la cursor me genero ya que me gusto como quedo el resultado final.</w:t>
       </w:r>
       <w:r>
         <w:br/>
@@ -1104,6 +1187,7 @@
   <w:style w:type="character" w:default="1" w:styleId="Fuentedeprrafopredeter">
     <w:name w:val="Default Paragraph Font"/>
     <w:uiPriority w:val="1"/>
+    <w:semiHidden/>
     <w:unhideWhenUsed/>
   </w:style>
   <w:style w:type="table" w:default="1" w:styleId="Tablanormal">

</xml_diff>